<commit_message>
Yet Another Portfolio Update
</commit_message>
<xml_diff>
--- a/public/StephenResume.docx
+++ b/public/StephenResume.docx
@@ -555,23 +555,7 @@
                 <w:color w:val="6B7280"/>
                 <w:sz w:val="19"/>
               </w:rPr>
-              <w:t>Full Stack Web Applications</w:t>
-            </w:r>
-            <w:r>
-              <w:rPr>
-                <w:rFonts w:ascii="Segoe UI" w:hAnsi="Segoe UI" w:cs="Segoe UI"/>
-                <w:color w:val="6B7280"/>
-                <w:sz w:val="19"/>
-              </w:rPr>
-              <w:t xml:space="preserve"> | </w:t>
-            </w:r>
-            <w:r>
-              <w:rPr>
-                <w:rFonts w:ascii="Segoe UI" w:hAnsi="Segoe UI" w:cs="Segoe UI"/>
-                <w:color w:val="6B7280"/>
-                <w:sz w:val="19"/>
-              </w:rPr>
-              <w:t>React, Node.js SQL, | C#, .NET</w:t>
+              <w:t>Full Stack Web Applications | React, Node.js SQL, | C#, .NET</w:t>
             </w:r>
           </w:p>
           <w:p>
@@ -590,7 +574,7 @@
                 <w:color w:val="2D3748"/>
                 <w:sz w:val="20"/>
               </w:rPr>
-              <w:t>Built database-backed web applications with frontend forms, backend routes, and persistent data storage.</w:t>
+              <w:t>Built web applications with frontend forms, backend routes, and persistent data storage.</w:t>
             </w:r>
           </w:p>
           <w:p>
@@ -2783,6 +2767,7 @@
   <w:style w:type="character" w:default="1" w:styleId="DefaultParagraphFont">
     <w:name w:val="Default Paragraph Font"/>
     <w:uiPriority w:val="1"/>
+    <w:semiHidden/>
     <w:unhideWhenUsed/>
   </w:style>
   <w:style w:type="table" w:default="1" w:styleId="TableNormal">

</xml_diff>